<commit_message>
Make Monthly Burn primary and archive intraday stack
</commit_message>
<xml_diff>
--- a/course/Model_Walkthrough.docx
+++ b/course/Model_Walkthrough.docx
@@ -44,7 +44,7 @@
           <w:color w:val="5C5C5C"/>
           <w:sz w:val="26"/>
         </w:rPr>
-        <w:t>How the intraday dispatch stack and monthly coal-burn tape work, with trader-focused definitions and interpretation notes.</w:t>
+        <w:t>How Monthly Burn works, with archived intraday stack notes, trader-focused definitions, and interpretation guidance.</w:t>
       </w:r>
     </w:p>
     <w:p/>
@@ -208,7 +208,7 @@
               <w:rPr>
                 <w:rFonts w:ascii="Calibri" w:hAnsi="Calibri"/>
               </w:rPr>
-              <w:t>KPX Cost Stack Lab and KPX Monthly Coal Burn Tape</w:t>
+              <w:t>Monthly Burn and archived KPX Cost Stack Lab</w:t>
             </w:r>
           </w:p>
         </w:tc>
@@ -367,7 +367,7 @@
               <w:rPr>
                 <w:rFonts w:ascii="Calibri" w:hAnsi="Calibri"/>
               </w:rPr>
-              <w:t>The monthly tool converts Korean power-market fundamentals into a coal trader's language: tonnes, cargoes, 3-month demand, LNG switch risk, and coal price headroom. It is not trying to be a black-box forecast. It is a transparent scenario engine that shows which market lever would change Korean thermal coal demand.</w:t>
+              <w:t>Monthly Burn converts Korean power-market fundamentals into a coal trader's language: tonnes, cargoes, 3-month demand, LNG switch risk, and coal price headroom. It is not trying to be a black-box forecast. It is a transparent scenario engine that shows which market lever would change Korean thermal coal demand.</w:t>
             </w:r>
           </w:p>
         </w:tc>

</xml_diff>

<commit_message>
Make model walkthrough share-ready
</commit_message>
<xml_diff>
--- a/course/Model_Walkthrough.docx
+++ b/course/Model_Walkthrough.docx
@@ -160,7 +160,7 @@
               <w:rPr>
                 <w:rFonts w:ascii="Calibri" w:hAnsi="Calibri"/>
               </w:rPr>
-              <w:t>Thermal coal trader, analyst, or hiring manager</w:t>
+              <w:t>Thermal coal trader or analyst</w:t>
             </w:r>
           </w:p>
         </w:tc>
@@ -2636,7 +2636,7 @@
         <w:pStyle w:val="Heading1"/>
       </w:pPr>
       <w:r>
-        <w:t>10. Questions to Be Ready For</w:t>
+        <w:t>10. Model Interpretation Notes</w:t>
       </w:r>
     </w:p>
     <w:tbl>
@@ -2677,7 +2677,7 @@
                 <w:b/>
                 <w:color w:val="24231F"/>
               </w:rPr>
-              <w:t>Likely question</w:t>
+              <w:t>Topic</w:t>
             </w:r>
           </w:p>
         </w:tc>
@@ -2703,7 +2703,7 @@
                 <w:b/>
                 <w:color w:val="24231F"/>
               </w:rPr>
-              <w:t>Strong answer</w:t>
+              <w:t>Interpretation</w:t>
             </w:r>
           </w:p>
         </w:tc>

</xml_diff>

<commit_message>
Remove intraday section from model walkthrough
</commit_message>
<xml_diff>
--- a/course/Model_Walkthrough.docx
+++ b/course/Model_Walkthrough.docx
@@ -44,7 +44,7 @@
           <w:color w:val="5C5C5C"/>
           <w:sz w:val="26"/>
         </w:rPr>
-        <w:t>How Monthly Burn works, with archived intraday stack notes, trader-focused definitions, and interpretation guidance.</w:t>
+        <w:t>How Monthly Burn works, with trader-focused definitions and interpretation guidance.</w:t>
       </w:r>
     </w:p>
     <w:p/>
@@ -208,7 +208,7 @@
               <w:rPr>
                 <w:rFonts w:ascii="Calibri" w:hAnsi="Calibri"/>
               </w:rPr>
-              <w:t>Monthly Burn and archived KPX Cost Stack Lab</w:t>
+              <w:t>Monthly Burn</w:t>
             </w:r>
           </w:p>
         </w:tc>
@@ -2576,67 +2576,7 @@
         <w:pStyle w:val="Heading1"/>
       </w:pPr>
       <w:r>
-        <w:t>9. Intraday Stack in One Page</w:t>
-      </w:r>
-    </w:p>
-    <w:p>
-      <w:r>
-        <w:rPr>
-          <w:rFonts w:ascii="Calibri" w:hAnsi="Calibri"/>
-        </w:rPr>
-        <w:t>The intraday stack is a one-hour dispatch teaching tool. It shows how recognized fuel costs, nuclear availability, renewables, coal caps, reserve scarcity, and fine-dust constraints can determine the marginal fuel and modeled SMP for an hour.</w:t>
-      </w:r>
-    </w:p>
-    <w:p>
-      <w:pPr>
-        <w:pStyle w:val="ListBullet"/>
-      </w:pPr>
-      <w:r>
-        <w:rPr>
-          <w:rFonts w:ascii="Calibri" w:hAnsi="Calibri"/>
-        </w:rPr>
-        <w:t>It ranks representative generation blocks by variable cost after mandatory and policy constraints.</w:t>
-      </w:r>
-    </w:p>
-    <w:p>
-      <w:pPr>
-        <w:pStyle w:val="ListBullet"/>
-      </w:pPr>
-      <w:r>
-        <w:rPr>
-          <w:rFonts w:ascii="Calibri" w:hAnsi="Calibri"/>
-        </w:rPr>
-        <w:t>It includes coal minimum-stable output as a must-run thermal block.</w:t>
-      </w:r>
-    </w:p>
-    <w:p>
-      <w:pPr>
-        <w:pStyle w:val="ListBullet"/>
-      </w:pPr>
-      <w:r>
-        <w:rPr>
-          <w:rFonts w:ascii="Calibri" w:hAnsi="Calibri"/>
-        </w:rPr>
-        <w:t>It shows why LNG often sets price even when coal produces a large amount of energy.</w:t>
-      </w:r>
-    </w:p>
-    <w:p>
-      <w:pPr>
-        <w:pStyle w:val="ListBullet"/>
-      </w:pPr>
-      <w:r>
-        <w:rPr>
-          <w:rFonts w:ascii="Calibri" w:hAnsi="Calibri"/>
-        </w:rPr>
-        <w:t>It is useful for explaining KPX mechanics, while the monthly model is more useful for cargo-demand discussion.</w:t>
-      </w:r>
-    </w:p>
-    <w:p>
-      <w:pPr>
-        <w:pStyle w:val="Heading1"/>
-      </w:pPr>
-      <w:r>
-        <w:t>10. Model Interpretation Notes</w:t>
+        <w:t>9. Model Interpretation Notes</w:t>
       </w:r>
     </w:p>
     <w:tbl>
@@ -3002,7 +2942,7 @@
         <w:pStyle w:val="Heading1"/>
       </w:pPr>
       <w:r>
-        <w:t>11. Current Model Assumptions</w:t>
+        <w:t>10. Current Model Assumptions</w:t>
       </w:r>
     </w:p>
     <w:tbl>
@@ -3604,7 +3544,7 @@
         <w:pStyle w:val="Heading1"/>
       </w:pPr>
       <w:r>
-        <w:t>12. Limitations and Upgrade Path</w:t>
+        <w:t>11. Limitations and Upgrade Path</w:t>
       </w:r>
     </w:p>
     <w:p>
@@ -3850,7 +3790,7 @@
           <w:rFonts w:ascii="Calibri" w:hAnsi="Calibri"/>
           <w:b/>
         </w:rPr>
-        <w:t xml:space="preserve">[S16] GitHub repository for KPX Cost Stack Lab. </w:t>
+        <w:t xml:space="preserve">[S16] GitHub repository for Monthly Burn. </w:t>
       </w:r>
       <w:r>
         <w:rPr>

</xml_diff>